<commit_message>
Aktualizacja zasad i bug fix dziedzieczenia
Zdolności Finezja i Brutalny.
Hierarchie:
ArmoryDisabledWeapon clearing
exclude_weapon_id
</commit_message>
<xml_diff>
--- a/app/static/docs/Moje OPR.docx
+++ b/app/static/docs/Moje OPR.docx
@@ -4294,6 +4294,8 @@
       <w:pPr>
         <w:spacing w:after="0"/>
         <w:rPr>
+          <w:b/>
+          <w:bCs/>
           <w:sz w:val="18"/>
           <w:szCs w:val="18"/>
         </w:rPr>
@@ -4343,6 +4345,29 @@
           <w:szCs w:val="18"/>
         </w:rPr>
         <w:t>dają dodatkowe normalne trafienie.</w:t>
+      </w:r>
+      <w:r>
+        <w:rPr>
+          <w:sz w:val="18"/>
+          <w:szCs w:val="18"/>
+        </w:rPr>
+        <w:br/>
+      </w:r>
+      <w:r>
+        <w:rPr>
+          <w:b/>
+          <w:bCs/>
+          <w:sz w:val="18"/>
+          <w:szCs w:val="18"/>
+        </w:rPr>
+        <w:t xml:space="preserve">Brutalny: </w:t>
+      </w:r>
+      <w:r>
+        <w:rPr>
+          <w:sz w:val="18"/>
+          <w:szCs w:val="18"/>
+        </w:rPr>
+        <w:t>W teście obrony nie ma automatycznych sukcesów.</w:t>
       </w:r>
     </w:p>
     <w:p>
@@ -6412,7 +6437,7 @@
           <w:sz w:val="18"/>
           <w:szCs w:val="18"/>
         </w:rPr>
-        <w:t>Brutalny</w:t>
+        <w:t>Finezja</w:t>
       </w:r>
       <w:r>
         <w:rPr>
@@ -10014,7 +10039,7 @@
                 <w:sz w:val="18"/>
                 <w:szCs w:val="18"/>
               </w:rPr>
-              <w:t>8</w:t>
+              <w:t>Parz broń</w:t>
             </w:r>
           </w:p>
         </w:tc>
@@ -10711,6 +10736,88 @@
                 <w:szCs w:val="18"/>
               </w:rPr>
               <w:t>-</w:t>
+            </w:r>
+          </w:p>
+        </w:tc>
+      </w:tr>
+      <w:tr>
+        <w:tc>
+          <w:tcPr>
+            <w:tcW w:w="1680" w:type="dxa"/>
+          </w:tcPr>
+          <w:p>
+            <w:pPr>
+              <w:rPr>
+                <w:sz w:val="18"/>
+                <w:szCs w:val="18"/>
+              </w:rPr>
+            </w:pPr>
+            <w:r>
+              <w:rPr>
+                <w:sz w:val="18"/>
+                <w:szCs w:val="18"/>
+              </w:rPr>
+              <w:t>Niestrudzony</w:t>
+            </w:r>
+          </w:p>
+        </w:tc>
+        <w:tc>
+          <w:tcPr>
+            <w:tcW w:w="1255" w:type="dxa"/>
+          </w:tcPr>
+          <w:p>
+            <w:pPr>
+              <w:rPr>
+                <w:sz w:val="18"/>
+                <w:szCs w:val="18"/>
+              </w:rPr>
+            </w:pPr>
+            <w:r>
+              <w:rPr>
+                <w:sz w:val="18"/>
+                <w:szCs w:val="18"/>
+              </w:rPr>
+              <w:t>Parz broń</w:t>
+            </w:r>
+          </w:p>
+        </w:tc>
+        <w:tc>
+          <w:tcPr>
+            <w:tcW w:w="974" w:type="dxa"/>
+          </w:tcPr>
+          <w:p>
+            <w:pPr>
+              <w:rPr>
+                <w:sz w:val="18"/>
+                <w:szCs w:val="18"/>
+              </w:rPr>
+            </w:pPr>
+            <w:r>
+              <w:rPr>
+                <w:sz w:val="18"/>
+                <w:szCs w:val="18"/>
+              </w:rPr>
+              <w:t>64</w:t>
+            </w:r>
+          </w:p>
+        </w:tc>
+        <w:tc>
+          <w:tcPr>
+            <w:tcW w:w="1048" w:type="dxa"/>
+          </w:tcPr>
+          <w:p>
+            <w:pPr>
+              <w:rPr>
+                <w:sz w:val="18"/>
+                <w:szCs w:val="18"/>
+              </w:rPr>
+            </w:pPr>
+            <w:r>
+              <w:rPr>
+                <w:sz w:val="18"/>
+                <w:szCs w:val="18"/>
+              </w:rPr>
+              <w:t>80</w:t>
             </w:r>
           </w:p>
         </w:tc>
@@ -11683,7 +11790,21 @@
           <w:sz w:val="18"/>
           <w:szCs w:val="18"/>
         </w:rPr>
-        <w:t xml:space="preserve">0 za Brutalny, </w:t>
+        <w:t xml:space="preserve">0 za </w:t>
+      </w:r>
+      <w:r>
+        <w:rPr>
+          <w:sz w:val="18"/>
+          <w:szCs w:val="18"/>
+        </w:rPr>
+        <w:t>Finezja</w:t>
+      </w:r>
+      <w:r>
+        <w:rPr>
+          <w:sz w:val="18"/>
+          <w:szCs w:val="18"/>
+        </w:rPr>
+        <w:t xml:space="preserve">, </w:t>
       </w:r>
       <w:r>
         <w:rPr>
@@ -12599,6 +12720,168 @@
                 <w:sz w:val="18"/>
                 <w:szCs w:val="18"/>
               </w:rPr>
+              <w:t>Brutalny</w:t>
+            </w:r>
+          </w:p>
+        </w:tc>
+        <w:tc>
+          <w:tcPr>
+            <w:tcW w:w="567" w:type="dxa"/>
+          </w:tcPr>
+          <w:p>
+            <w:pPr>
+              <w:rPr>
+                <w:sz w:val="18"/>
+                <w:szCs w:val="18"/>
+              </w:rPr>
+            </w:pPr>
+            <w:r>
+              <w:rPr>
+                <w:sz w:val="18"/>
+                <w:szCs w:val="18"/>
+              </w:rPr>
+              <w:t>0</w:t>
+            </w:r>
+          </w:p>
+        </w:tc>
+        <w:tc>
+          <w:tcPr>
+            <w:tcW w:w="567" w:type="dxa"/>
+          </w:tcPr>
+          <w:p>
+            <w:pPr>
+              <w:rPr>
+                <w:sz w:val="18"/>
+                <w:szCs w:val="18"/>
+              </w:rPr>
+            </w:pPr>
+            <w:r>
+              <w:rPr>
+                <w:sz w:val="18"/>
+                <w:szCs w:val="18"/>
+              </w:rPr>
+              <w:t>0,01</w:t>
+            </w:r>
+          </w:p>
+        </w:tc>
+        <w:tc>
+          <w:tcPr>
+            <w:tcW w:w="567" w:type="dxa"/>
+          </w:tcPr>
+          <w:p>
+            <w:pPr>
+              <w:rPr>
+                <w:sz w:val="18"/>
+                <w:szCs w:val="18"/>
+              </w:rPr>
+            </w:pPr>
+            <w:r>
+              <w:rPr>
+                <w:sz w:val="18"/>
+                <w:szCs w:val="18"/>
+              </w:rPr>
+              <w:t>0,02</w:t>
+            </w:r>
+          </w:p>
+        </w:tc>
+        <w:tc>
+          <w:tcPr>
+            <w:tcW w:w="567" w:type="dxa"/>
+          </w:tcPr>
+          <w:p>
+            <w:pPr>
+              <w:rPr>
+                <w:sz w:val="18"/>
+                <w:szCs w:val="18"/>
+              </w:rPr>
+            </w:pPr>
+            <w:r>
+              <w:rPr>
+                <w:sz w:val="18"/>
+                <w:szCs w:val="18"/>
+              </w:rPr>
+              <w:t>0,1</w:t>
+            </w:r>
+          </w:p>
+        </w:tc>
+        <w:tc>
+          <w:tcPr>
+            <w:tcW w:w="567" w:type="dxa"/>
+          </w:tcPr>
+          <w:p>
+            <w:pPr>
+              <w:rPr>
+                <w:sz w:val="18"/>
+                <w:szCs w:val="18"/>
+              </w:rPr>
+            </w:pPr>
+            <w:r>
+              <w:rPr>
+                <w:sz w:val="18"/>
+                <w:szCs w:val="18"/>
+              </w:rPr>
+              <w:t>0,2</w:t>
+            </w:r>
+          </w:p>
+        </w:tc>
+        <w:tc>
+          <w:tcPr>
+            <w:tcW w:w="567" w:type="dxa"/>
+          </w:tcPr>
+          <w:p>
+            <w:pPr>
+              <w:rPr>
+                <w:sz w:val="18"/>
+                <w:szCs w:val="18"/>
+              </w:rPr>
+            </w:pPr>
+            <w:r>
+              <w:rPr>
+                <w:sz w:val="18"/>
+                <w:szCs w:val="18"/>
+              </w:rPr>
+              <w:t>0,3</w:t>
+            </w:r>
+          </w:p>
+        </w:tc>
+        <w:tc>
+          <w:tcPr>
+            <w:tcW w:w="567" w:type="dxa"/>
+          </w:tcPr>
+          <w:p>
+            <w:pPr>
+              <w:rPr>
+                <w:sz w:val="18"/>
+                <w:szCs w:val="18"/>
+              </w:rPr>
+            </w:pPr>
+            <w:r>
+              <w:rPr>
+                <w:sz w:val="18"/>
+                <w:szCs w:val="18"/>
+              </w:rPr>
+              <w:t>0,4</w:t>
+            </w:r>
+          </w:p>
+        </w:tc>
+      </w:tr>
+      <w:tr>
+        <w:tc>
+          <w:tcPr>
+            <w:tcW w:w="988" w:type="dxa"/>
+          </w:tcPr>
+          <w:p>
+            <w:pPr>
+              <w:rPr>
+                <w:sz w:val="18"/>
+                <w:szCs w:val="18"/>
+              </w:rPr>
+            </w:pPr>
+            <w:r>
+              <w:rPr>
+                <w:sz w:val="18"/>
+                <w:szCs w:val="18"/>
+              </w:rPr>
               <w:t>Przebijająca (*)</w:t>
             </w:r>
           </w:p>
@@ -14014,6 +14297,7 @@
           <w:sz w:val="18"/>
           <w:szCs w:val="18"/>
         </w:rPr>
+        <w:lastRenderedPageBreak/>
         <w:t>Łatanie: 20</w:t>
       </w:r>
     </w:p>
@@ -14030,7 +14314,6 @@
           <w:sz w:val="18"/>
           <w:szCs w:val="18"/>
         </w:rPr>
-        <w:lastRenderedPageBreak/>
         <w:t>Rozkaz</w:t>
       </w:r>
       <w:r>
@@ -15749,7 +16032,6 @@
   <w:style w:type="character" w:default="1" w:styleId="Domylnaczcionkaakapitu">
     <w:name w:val="Default Paragraph Font"/>
     <w:uiPriority w:val="1"/>
-    <w:semiHidden/>
     <w:unhideWhenUsed/>
   </w:style>
   <w:style w:type="table" w:default="1" w:styleId="Standardowy">

</xml_diff>